<commit_message>
Give dim_unit and dim_employee surrogate keys to dim_community
dim_unit.community_id and dim_employee.latest_community_id were the only
remaining dimension-to-dimension references still on natural keys --
every fact table's FK to a dimension already used surrogate keys. Switches
both to community_key (resolved by merging against dim_community in
build_dim_unit/build_dim_employee), which also removes the natural-key
join workaround 01_monthly_occupancy.sql needed for unit_counts.

Adds referential_integrity checks for the two new outrigger FKs.

Co-Authored-By: Claude Sonnet 5 <noreply@anthropic.com>
</commit_message>
<xml_diff>
--- a/validation/latest_report.docx
+++ b/validation/latest_report.docx
@@ -15,7 +15,7 @@
         <w:rPr>
           <w:i/>
         </w:rPr>
-        <w:t>Generated 2026-07-08T16:59:01.885949+00:00 UTC · based on the pipeline run at 2026-07-08T16:58:59.729464+00:00 UTC</w:t>
+        <w:t>Generated 2026-07-08T17:15:13.594230+00:00 UTC · based on the pipeline run at 2026-07-08T17:15:11.620027+00:00 UTC</w:t>
       </w:r>
     </w:p>
     <w:p>
@@ -24,7 +24,7 @@
           <w:b/>
           <w:color w:val="1A7F37"/>
         </w:rPr>
-        <w:t>Safe to approve — all 47 accuracy and completeness checks passed.</w:t>
+        <w:t>Safe to approve — all 49 accuracy and completeness checks passed.</w:t>
       </w:r>
     </w:p>
     <w:p>
@@ -1429,6 +1429,110 @@
           <w:p>
             <w:r>
               <w:t>referential_integrity[fact_resident_day.community_key]</w:t>
+            </w:r>
+          </w:p>
+        </w:tc>
+        <w:tc>
+          <w:tcPr>
+            <w:tcW w:type="dxa" w:w="1728"/>
+          </w:tcPr>
+          <w:p>
+            <w:r>
+              <w:t>PASS</w:t>
+            </w:r>
+          </w:p>
+        </w:tc>
+        <w:tc>
+          <w:tcPr>
+            <w:tcW w:type="dxa" w:w="1728"/>
+          </w:tcPr>
+          <w:p>
+            <w:r>
+              <w:t>n/a</w:t>
+            </w:r>
+          </w:p>
+        </w:tc>
+        <w:tc>
+          <w:tcPr>
+            <w:tcW w:type="dxa" w:w="1728"/>
+          </w:tcPr>
+          <w:p>
+            <w:r>
+              <w:t>n/a</w:t>
+            </w:r>
+          </w:p>
+        </w:tc>
+        <w:tc>
+          <w:tcPr>
+            <w:tcW w:type="dxa" w:w="1728"/>
+          </w:tcPr>
+          <w:p>
+            <w:r>
+              <w:t>{"orphan_rows": 0}</w:t>
+            </w:r>
+          </w:p>
+        </w:tc>
+      </w:tr>
+      <w:tr>
+        <w:tc>
+          <w:tcPr>
+            <w:tcW w:type="dxa" w:w="1728"/>
+          </w:tcPr>
+          <w:p>
+            <w:r>
+              <w:t>referential_integrity[dim_unit.community_key]</w:t>
+            </w:r>
+          </w:p>
+        </w:tc>
+        <w:tc>
+          <w:tcPr>
+            <w:tcW w:type="dxa" w:w="1728"/>
+          </w:tcPr>
+          <w:p>
+            <w:r>
+              <w:t>PASS</w:t>
+            </w:r>
+          </w:p>
+        </w:tc>
+        <w:tc>
+          <w:tcPr>
+            <w:tcW w:type="dxa" w:w="1728"/>
+          </w:tcPr>
+          <w:p>
+            <w:r>
+              <w:t>n/a</w:t>
+            </w:r>
+          </w:p>
+        </w:tc>
+        <w:tc>
+          <w:tcPr>
+            <w:tcW w:type="dxa" w:w="1728"/>
+          </w:tcPr>
+          <w:p>
+            <w:r>
+              <w:t>n/a</w:t>
+            </w:r>
+          </w:p>
+        </w:tc>
+        <w:tc>
+          <w:tcPr>
+            <w:tcW w:type="dxa" w:w="1728"/>
+          </w:tcPr>
+          <w:p>
+            <w:r>
+              <w:t>{"orphan_rows": 0}</w:t>
+            </w:r>
+          </w:p>
+        </w:tc>
+      </w:tr>
+      <w:tr>
+        <w:tc>
+          <w:tcPr>
+            <w:tcW w:type="dxa" w:w="1728"/>
+          </w:tcPr>
+          <w:p>
+            <w:r>
+              <w:t>referential_integrity[dim_employee.latest_community_key]</w:t>
             </w:r>
           </w:p>
         </w:tc>

</xml_diff>

<commit_message>
Rename dim_resident_care_level's surrogate key to resident_care_level_key
care_level_key read ambiguously next to fact_resident_day's own
care_level-adjacent columns. Renamed for clarity across gold.py, ddl.sql,
05_incident_rate.sql, validation/checks.py, and sql/README.md.

Co-Authored-By: Claude Sonnet 5 <noreply@anthropic.com>
</commit_message>
<xml_diff>
--- a/validation/latest_report.docx
+++ b/validation/latest_report.docx
@@ -15,7 +15,7 @@
         <w:rPr>
           <w:i/>
         </w:rPr>
-        <w:t>Generated 2026-07-08T17:49:26.966937+00:00 UTC · based on the pipeline run at 2026-07-08T17:46:37.627745+00:00 UTC</w:t>
+        <w:t>Generated 2026-07-08T18:05:24.699170+00:00 UTC · based on the pipeline run at 2026-07-08T18:05:22.771073+00:00 UTC</w:t>
       </w:r>
     </w:p>
     <w:p>
@@ -1948,7 +1948,7 @@
           </w:tcPr>
           <w:p>
             <w:r>
-              <w:t>referential_integrity[fact_resident_day.care_level_key]</w:t>
+              <w:t>referential_integrity[fact_resident_day.resident_care_level_key]</w:t>
             </w:r>
           </w:p>
         </w:tc>
@@ -2104,7 +2104,7 @@
           </w:tcPr>
           <w:p>
             <w:r>
-              <w:t>primary_key_uniqueness[dim_resident_care_level.care_level_key]</w:t>
+              <w:t>primary_key_uniqueness[dim_resident_care_level.resident_care_level_key]</w:t>
             </w:r>
           </w:p>
         </w:tc>

</xml_diff>